<commit_message>
chore: finalize kbs claim-boundary package
</commit_message>
<xml_diff>
--- a/paper/kbs_submission/final_package/Highlights.docx
+++ b/paper/kbs_submission/final_package/Highlights.docx
@@ -3,95 +3,43 @@
 <w:document xmlns:wpc="http://schemas.microsoft.com/office/word/2010/wordprocessingCanvas" xmlns:mo="http://schemas.microsoft.com/office/mac/office/2008/main" xmlns:mc="http://schemas.openxmlformats.org/markup-compatibility/2006" xmlns:mv="urn:schemas-microsoft-com:mac:vml" xmlns:o="urn:schemas-microsoft-com:office:office" xmlns:r="http://schemas.openxmlformats.org/officeDocument/2006/relationships" xmlns:m="http://schemas.openxmlformats.org/officeDocument/2006/math" xmlns:v="urn:schemas-microsoft-com:vml" xmlns:wp14="http://schemas.microsoft.com/office/word/2010/wordprocessingDrawing" xmlns:wp="http://schemas.openxmlformats.org/drawingml/2006/wordprocessingDrawing" xmlns:w10="urn:schemas-microsoft-com:office:word" xmlns:w="http://schemas.openxmlformats.org/wordprocessingml/2006/main" xmlns:w14="http://schemas.microsoft.com/office/word/2010/wordml" xmlns:wpg="http://schemas.microsoft.com/office/word/2010/wordprocessingGroup" xmlns:wpi="http://schemas.microsoft.com/office/word/2010/wordprocessingInk" xmlns:wne="http://schemas.microsoft.com/office/word/2006/wordml" xmlns:wps="http://schemas.microsoft.com/office/word/2010/wordprocessingShape" mc:Ignorable="w14 wp14">
   <w:body>
     <w:p>
-      <w:pPr>
-        <w:pStyle w:val="Heading1"/>
-        <w:jc w:val="center"/>
-      </w:pPr>
       <w:r>
-        <w:rPr>
-          <w:rFonts w:ascii="Calibri" w:hAnsi="Calibri"/>
-        </w:rPr>
         <w:t>Highlights</w:t>
       </w:r>
     </w:p>
     <w:p>
-      <w:pPr>
-        <w:jc w:val="center"/>
-      </w:pPr>
       <w:r>
-        <w:rPr>
-          <w:rFonts w:ascii="Calibri" w:hAnsi="Calibri"/>
-          <w:b/>
-        </w:rPr>
-        <w:t>Structurally-Calibrated Functional Attribution: A Methodology for Process Supervision Weighting in Reflective Reasoning</w:t>
+        <w:t>Structurally-Calibrated Functional Attribution for Audit Prioritization in Knowledge-Intensive Reasoning</w:t>
       </w:r>
     </w:p>
     <w:p>
-      <w:pPr>
-        <w:jc w:val="center"/>
-      </w:pPr>
       <w:r>
-        <w:rPr>
-          <w:rFonts w:ascii="Calibri" w:hAnsi="Calibri"/>
-        </w:rPr>
         <w:t>Haoran Ma, Ningning Wang</w:t>
       </w:r>
     </w:p>
     <w:p>
-      <w:pPr>
-        <w:pStyle w:val="ListBullet"/>
-        <w:spacing w:after="80"/>
-      </w:pPr>
       <w:r>
-        <w:rPr>
-          <w:rFonts w:ascii="Calibri" w:hAnsi="Calibri"/>
-          <w:sz w:val="22"/>
-        </w:rPr>
-        <w:t>SC-FMA calibrates interventional utility into supervision weights.</w:t>
+        <w:t>SC-FMA calibrates coarse utility or proxy fidelity into auditable verification-step weights.</w:t>
       </w:r>
     </w:p>
     <w:p>
-      <w:pPr>
-        <w:pStyle w:val="ListBullet"/>
-        <w:spacing w:after="80"/>
-      </w:pPr>
       <w:r>
-        <w:rPr>
-          <w:rFonts w:ascii="Calibri" w:hAnsi="Calibri"/>
-          <w:sz w:val="22"/>
-        </w:rPr>
-        <w:t>A convex SCU objective protects structure, redundancy, and bottlenecks.</w:t>
+        <w:t>The PRM800K stratified readout gives moderate, preliminary support for PRM800K-like audit prioritization.</w:t>
       </w:r>
     </w:p>
     <w:p>
-      <w:pPr>
-        <w:pStyle w:val="ListBullet"/>
-        <w:spacing w:after="80"/>
-      </w:pPr>
       <w:r>
-        <w:rPr>
-          <w:rFonts w:ascii="Calibri" w:hAnsi="Calibri"/>
-          <w:sz w:val="22"/>
-        </w:rPr>
-        <w:t>SC-FMA QP improves controlled synthetic ranking over raw CIU and baselines.</w:t>
+        <w:t>QP is strongest only on the controlled synthetic benchmark; Ridge is closest on the PRM800K locked split.</w:t>
       </w:r>
     </w:p>
     <w:p>
-      <w:pPr>
-        <w:pStyle w:val="ListBullet"/>
-        <w:spacing w:after="80"/>
-      </w:pPr>
       <w:r>
-        <w:rPr>
-          <w:rFonts w:ascii="Calibri" w:hAnsi="Calibri"/>
-          <w:sz w:val="22"/>
-        </w:rPr>
-        <w:t>Ridge is the closest SC-FMA approximation on the PRM800K locked split.</w:t>
+        <w:t>Downstream PRM training, GSM8K/HotpotQA replay, and production KBS deployment remain unvalidated.</w:t>
       </w:r>
     </w:p>
     <w:sectPr>
       <w:pgSz w:w="12240" w:h="15840"/>
-      <w:pgMar w:top="1440" w:right="1440" w:bottom="1440" w:left="1440" w:header="708" w:footer="708" w:gutter="0"/>
+      <w:pgMar w:top="1440" w:right="1800" w:bottom="1440" w:left="1800" w:header="720" w:footer="720" w:gutter="0"/>
       <w:cols w:space="720"/>
       <w:docGrid w:linePitch="360"/>
     </w:sectPr>
@@ -462,13 +410,6 @@
     <w:name w:val="Normal"/>
     <w:qFormat/>
     <w:rsid w:val="00FC693F"/>
-    <w:pPr>
-      <w:spacing w:before="0" w:after="120" w:line="264" w:lineRule="auto"/>
-    </w:pPr>
-    <w:rPr>
-      <w:rFonts w:ascii="Calibri" w:hAnsi="Calibri"/>
-      <w:sz w:val="22"/>
-    </w:rPr>
   </w:style>
   <w:style w:type="paragraph" w:styleId="Header">
     <w:name w:val="header"/>
@@ -525,15 +466,15 @@
     <w:pPr>
       <w:keepNext/>
       <w:keepLines/>
-      <w:spacing w:before="320" w:after="160"/>
+      <w:spacing w:before="480" w:after="0"/>
       <w:outlineLvl w:val="0"/>
     </w:pPr>
     <w:rPr>
-      <w:rFonts w:asciiTheme="majorHAnsi" w:eastAsiaTheme="majorEastAsia" w:hAnsiTheme="majorHAnsi" w:cstheme="majorBidi" w:ascii="Calibri" w:hAnsi="Calibri"/>
+      <w:rFonts w:asciiTheme="majorHAnsi" w:eastAsiaTheme="majorEastAsia" w:hAnsiTheme="majorHAnsi" w:cstheme="majorBidi"/>
       <w:b/>
       <w:bCs/>
-      <w:color w:val="2E74B5"/>
-      <w:sz w:val="32"/>
+      <w:color w:val="365F91" w:themeColor="accent1" w:themeShade="BF"/>
+      <w:sz w:val="28"/>
       <w:szCs w:val="28"/>
     </w:rPr>
   </w:style>
@@ -549,14 +490,14 @@
     <w:pPr>
       <w:keepNext/>
       <w:keepLines/>
-      <w:spacing w:before="240" w:after="120"/>
+      <w:spacing w:before="200" w:after="0"/>
       <w:outlineLvl w:val="1"/>
     </w:pPr>
     <w:rPr>
-      <w:rFonts w:asciiTheme="majorHAnsi" w:eastAsiaTheme="majorEastAsia" w:hAnsiTheme="majorHAnsi" w:cstheme="majorBidi" w:ascii="Calibri" w:hAnsi="Calibri"/>
+      <w:rFonts w:asciiTheme="majorHAnsi" w:eastAsiaTheme="majorEastAsia" w:hAnsiTheme="majorHAnsi" w:cstheme="majorBidi"/>
       <w:b/>
       <w:bCs/>
-      <w:color w:val="2E74B5"/>
+      <w:color w:val="4F81BD" w:themeColor="accent1"/>
       <w:sz w:val="26"/>
       <w:szCs w:val="26"/>
     </w:rPr>
@@ -573,15 +514,14 @@
     <w:pPr>
       <w:keepNext/>
       <w:keepLines/>
-      <w:spacing w:before="160" w:after="80"/>
+      <w:spacing w:before="200" w:after="0"/>
       <w:outlineLvl w:val="2"/>
     </w:pPr>
     <w:rPr>
-      <w:rFonts w:asciiTheme="majorHAnsi" w:eastAsiaTheme="majorEastAsia" w:hAnsiTheme="majorHAnsi" w:cstheme="majorBidi" w:ascii="Calibri" w:hAnsi="Calibri"/>
+      <w:rFonts w:asciiTheme="majorHAnsi" w:eastAsiaTheme="majorEastAsia" w:hAnsiTheme="majorHAnsi" w:cstheme="majorBidi"/>
       <w:b/>
       <w:bCs/>
-      <w:color w:val="1F4D78"/>
-      <w:sz w:val="24"/>
+      <w:color w:val="4F81BD" w:themeColor="accent1"/>
     </w:rPr>
   </w:style>
   <w:style w:type="paragraph" w:styleId="Heading4">

</xml_diff>

<commit_message>
Update KBS submission claims and package artifacts
</commit_message>
<xml_diff>
--- a/paper/kbs_submission/final_package/Highlights.docx
+++ b/paper/kbs_submission/final_package/Highlights.docx
@@ -3,43 +3,75 @@
 <w:document xmlns:wpc="http://schemas.microsoft.com/office/word/2010/wordprocessingCanvas" xmlns:mo="http://schemas.microsoft.com/office/mac/office/2008/main" xmlns:mc="http://schemas.openxmlformats.org/markup-compatibility/2006" xmlns:mv="urn:schemas-microsoft-com:mac:vml" xmlns:o="urn:schemas-microsoft-com:office:office" xmlns:r="http://schemas.openxmlformats.org/officeDocument/2006/relationships" xmlns:m="http://schemas.openxmlformats.org/officeDocument/2006/math" xmlns:v="urn:schemas-microsoft-com:vml" xmlns:wp14="http://schemas.microsoft.com/office/word/2010/wordprocessingDrawing" xmlns:wp="http://schemas.openxmlformats.org/drawingml/2006/wordprocessingDrawing" xmlns:w10="urn:schemas-microsoft-com:office:word" xmlns:w="http://schemas.openxmlformats.org/wordprocessingml/2006/main" xmlns:w14="http://schemas.microsoft.com/office/word/2010/wordml" xmlns:wpg="http://schemas.microsoft.com/office/word/2010/wordprocessingGroup" xmlns:wpi="http://schemas.microsoft.com/office/word/2010/wordprocessingInk" xmlns:wne="http://schemas.microsoft.com/office/word/2006/wordml" xmlns:wps="http://schemas.microsoft.com/office/word/2010/wordprocessingShape" mc:Ignorable="w14 wp14">
   <w:body>
     <w:p>
+      <w:pPr>
+        <w:pStyle w:val="Heading1"/>
+      </w:pPr>
       <w:r>
         <w:t>Highlights</w:t>
       </w:r>
     </w:p>
     <w:p>
+      <w:pPr>
+        <w:jc w:val="center"/>
+      </w:pPr>
       <w:r>
+        <w:rPr>
+          <w:b/>
+        </w:rPr>
         <w:t>Structurally-Calibrated Functional Attribution for Audit Prioritization in Knowledge-Intensive Reasoning</w:t>
       </w:r>
     </w:p>
     <w:p>
+      <w:pPr>
+        <w:jc w:val="center"/>
+      </w:pPr>
       <w:r>
-        <w:t>Haoran Ma, Ningning Wang</w:t>
+        <w:t>Haoran Ma; Ningning Wang</w:t>
       </w:r>
     </w:p>
     <w:p>
+      <w:pPr>
+        <w:pStyle w:val="ListBullet"/>
+      </w:pPr>
       <w:r>
-        <w:t>SC-FMA calibrates coarse utility or proxy fidelity into auditable verification-step weights.</w:t>
+        <w:t>SC-FMA calibrates utility into auditable verification-step weights.</w:t>
       </w:r>
     </w:p>
     <w:p>
+      <w:pPr>
+        <w:pStyle w:val="ListBullet"/>
+      </w:pPr>
       <w:r>
-        <w:t>The PRM800K stratified readout gives moderate, preliminary support for PRM800K-like audit prioritization.</w:t>
+        <w:t>Structural stress-test shows redundancy and bottleneck terms matter in their designed regime.</w:t>
       </w:r>
     </w:p>
     <w:p>
+      <w:pPr>
+        <w:pStyle w:val="ListBullet"/>
+      </w:pPr>
       <w:r>
-        <w:t>QP is strongest only on the controlled synthetic benchmark; Ridge is closest on the PRM800K locked split.</w:t>
+        <w:t>Countries-KG pilot shows typed ontology edges reorder structural-necessity diagnostics.</w:t>
       </w:r>
     </w:p>
     <w:p>
+      <w:pPr>
+        <w:pStyle w:val="ListBullet"/>
+      </w:pPr>
       <w:r>
-        <w:t>Downstream PRM training, GSM8K/HotpotQA replay, and production KBS deployment remain unvalidated.</w:t>
+        <w:t>PRM800K readout gives preliminary audit-prioritization support while Ridge preserves w_struct.</w:t>
+      </w:r>
+    </w:p>
+    <w:p>
+      <w:pPr>
+        <w:pStyle w:val="ListBullet"/>
+      </w:pPr>
+      <w:r>
+        <w:t>PRM training, replay, and production KBS deployment remain unvalidated.</w:t>
       </w:r>
     </w:p>
     <w:sectPr>
       <w:pgSz w:w="12240" w:h="15840"/>
-      <w:pgMar w:top="1440" w:right="1800" w:bottom="1440" w:left="1800" w:header="720" w:footer="720" w:gutter="0"/>
+      <w:pgMar w:top="1440" w:right="1440" w:bottom="1440" w:left="1440" w:header="720" w:footer="720" w:gutter="0"/>
       <w:cols w:space="720"/>
       <w:docGrid w:linePitch="360"/>
     </w:sectPr>
@@ -410,6 +442,10 @@
     <w:name w:val="Normal"/>
     <w:qFormat/>
     <w:rsid w:val="00FC693F"/>
+    <w:rPr>
+      <w:rFonts w:ascii="Times New Roman" w:hAnsi="Times New Roman"/>
+      <w:sz w:val="22"/>
+    </w:rPr>
   </w:style>
   <w:style w:type="paragraph" w:styleId="Header">
     <w:name w:val="header"/>

</xml_diff>